<commit_message>
test(corpus): an empty header for E-header-cut's footer case; batch 8 cases that tell rules apart
E-header-cut's footer section names an empty header of its own, so it no
longer shows the A5 case's header. The style size pair 12/12 becomes 13/12,
where the two rules left open predict different sizes; E-table-autofit-shares
gets a span that ends before the last column; each case of the
E-table-autofit-beside documents starts a page; E-number-formats-letters
restarts at 520, 1040 and 1300 too. The test follows header inheritance,
checks the shading bands, that each split table starts on its page and
crosses it, and every paragraph of E-para-shading-borders-sides.
</commit_message>
<xml_diff>
--- a/tests/corpus/word-rules/E-header-cut.docx
+++ b/tests/corpus/word-rules/E-header-cut.docx
@@ -86,6 +86,7 @@
       </w:r>
     </w:p>
     <w:sectPr>
+      <w:headerReference w:type="default" r:id="rIdheader6"/>
       <w:footerReference w:type="default" r:id="rIdfooter6"/>
       <w:pgSz w:w="11906" w:h="16838"/>
       <w:pgMar w:top="1440" w:right="1440" w:bottom="1440" w:left="1440" w:header="708" w:footer="708" w:gutter="0"/>
@@ -5180,6 +5181,16 @@
       <w:br/>
       <w:t xml:space="preserve">header line 40</w:t>
     </w:r>
+  </w:p>
+</w:hdr>
+</file>
+
+<file path=word/header6.xml><?xml version="1.0" encoding="utf-8"?>
+<w:hdr xmlns:w="http://schemas.openxmlformats.org/wordprocessingml/2006/main" xmlns:r="http://schemas.openxmlformats.org/officeDocument/2006/relationships">
+  <w:p>
+    <w:pPr>
+      <w:spacing w:line="240" w:lineRule="exact"/>
+    </w:pPr>
   </w:p>
 </w:hdr>
 </file>

</xml_diff>